<commit_message>
docs: drop the course framing and personal names from the documents
The documents describe the product, so they no longer mention a course,
an instructor or a term, and the sources carry no author name. Rebuilt
Word and PDF files and regenerated diagrams follow the docs/cloud path.
</commit_message>
<xml_diff>
--- a/docs/cloud/dist/en/01-proposal.docx
+++ b/docs/cloud/dist/en/01-proposal.docx
@@ -16,14 +16,6 @@
       </w:pPr>
       <w:r>
         <w:t xml:space="preserve">Project Proposal — A SQL-Backed Platform-as-a-Service with a Customer Storefront and an Administration Console</w:t>
-      </w:r>
-    </w:p>
-    <w:p>
-      <w:pPr>
-        <w:pStyle w:val="Author"/>
-      </w:pPr>
-      <w:r>
-        <w:t xml:space="preserve">Nima Sarayan</w:t>
       </w:r>
     </w:p>
     <w:p>
@@ -115,7 +107,7 @@
         <w:pStyle w:val="BodyText"/>
       </w:pPr>
       <w:r>
-        <w:t xml:space="preserve">This proposal describes a university project that closes both gaps and documents the result to an academic standard.</w:t>
+        <w:t xml:space="preserve">This proposal describes a project that closes both gaps and documents the result thoroughly.</w:t>
       </w:r>
     </w:p>
     <w:bookmarkEnd w:id="20"/>
@@ -593,7 +585,7 @@
               <w:pStyle w:val="Compact"/>
             </w:pPr>
             <w:r>
-              <w:t xml:space="preserve">Document the system to an academic standard.</w:t>
+              <w:t xml:space="preserve">Document the system to an professional standard.</w:t>
             </w:r>
           </w:p>
         </w:tc>
@@ -981,7 +973,7 @@
       <w:r>
         <w:drawing>
           <wp:inline>
-            <wp:extent cx="5334000" cy="3259236"/>
+            <wp:extent cx="5334000" cy="3423192"/>
             <wp:effectExtent b="0" l="0" r="0" t="0"/>
             <wp:docPr descr="Planned schedule of the project" title="" id="26" name="Picture"/>
             <a:graphic>
@@ -1002,7 +994,7 @@
                   <pic:spPr bwMode="auto">
                     <a:xfrm>
                       <a:off x="0" y="0"/>
-                      <a:ext cx="5334000" cy="3259236"/>
+                      <a:ext cx="5334000" cy="3423192"/>
                     </a:xfrm>
                     <a:prstGeom prst="rect">
                       <a:avLst/>

</xml_diff>